<commit_message>
Add files via GitMob upload
</commit_message>
<xml_diff>
--- a/docs/maintenance/AI开发项目_Bug修改规范.docx
+++ b/docs/maintenance/AI开发项目_Bug修改规范.docx
@@ -7946,6 +7946,562 @@
           <w:sz w:val="21"/>
         </w:rPr>
         <w:t>私人构建同步后必须检查 app.js、wedding-game.js、wedding-game.css 和小手机.html 与 PhoneWeb.bundle 哈希一致，核对版本号，并自动化跑通模拟零写入、日历精确时间、非情侣拒绝、正式礼成持久化与重复礼成去重。网页发布、Git 提交、Git 推送、Mac 编译与真机验证必须分别记录，禁止互相替代。</w:t>
+      </w:r>
+    </w:p>
+    <w:p>
+      <w:r>
+        <w:br w:type="page"/>
+      </w:r>
+    </w:p>
+    <w:p>
+      <w:pPr>
+        <w:pStyle w:val="Heading1"/>
+      </w:pPr>
+      <w:r>
+        <w:rPr>
+          <w:rFonts w:ascii="等线" w:hAnsi="等线" w:eastAsia="等线"/>
+          <w:sz w:val="32"/>
+        </w:rPr>
+        <w:t>婚礼人物一致性与单幕覆盖规范（v989／1.0.110 起）</w:t>
+      </w:r>
+    </w:p>
+    <w:p>
+      <w:pPr>
+        <w:spacing w:after="120" w:line="300" w:lineRule="auto"/>
+      </w:pPr>
+      <w:r>
+        <w:rPr>
+          <w:rFonts w:ascii="等线" w:hAnsi="等线" w:eastAsia="等线"/>
+          <w:sz w:val="21"/>
+        </w:rPr>
+        <w:t>同一场婚礼必须只有一个人物图像身份锚点，固定为第一幕。第 2～6 幕的首次生成、动作复核失败重试和用户主动单幕重做都只能参考第一幕，不得改为最近成功幕、相邻幕或随机成功幕。提示词身份摘要不能替代实际第一幕图片输入。</w:t>
+      </w:r>
+    </w:p>
+    <w:p>
+      <w:pPr>
+        <w:spacing w:after="120" w:line="300" w:lineRule="auto"/>
+      </w:pPr>
+      <w:r>
+        <w:rPr>
+          <w:rFonts w:ascii="等线" w:hAnsi="等线" w:eastAsia="等线"/>
+          <w:sz w:val="21"/>
+        </w:rPr>
+        <w:t>整场准备必须先让第一幕进入成功图或预设回退终态，再生成第二幕。每一幕的首次失败应当在进入下一幕前完成最多两次重试，避免后续幕在首幕身份尚未确定时独立随机人物。接口不能接收参考图时，不得静默降级为无参考生图并假装保持一致。</w:t>
+      </w:r>
+    </w:p>
+    <w:p>
+      <w:pPr>
+        <w:spacing w:after="120" w:line="300" w:lineRule="auto"/>
+      </w:pPr>
+      <w:r>
+        <w:rPr>
+          <w:rFonts w:ascii="等线" w:hAnsi="等线" w:eastAsia="等线"/>
+          <w:sz w:val="21"/>
+        </w:rPr>
+        <w:t>单幕重做属于安全覆盖事务：开始前读取并保留原 src、verified 与准备记录；新图最多尝试三次，只有通过当前幕动作校验与第一幕人物一致性校验、写入新缓存键后，才更新 prepared.sceneKeys[scene]。任一步失败都恢复原图，不改其他 sceneKeys、婚书、关系或记忆。</w:t>
+      </w:r>
+    </w:p>
+    <w:p>
+      <w:pPr>
+        <w:spacing w:after="120" w:line="300" w:lineRule="auto"/>
+      </w:pPr>
+      <w:r>
+        <w:rPr>
+          <w:rFonts w:ascii="等线" w:hAnsi="等线" w:eastAsia="等线"/>
+          <w:sz w:val="21"/>
+        </w:rPr>
+        <w:t>第一幕自身单独重做时必须把当前旧第一幕作为输入参考，以保持原人物，只修正动作与构图。若用户希望换成全新人物，必须走整场重新生成，不能借单幕按钮暗中换掉身份锚点。</w:t>
+      </w:r>
+    </w:p>
+    <w:p>
+      <w:r>
+        <w:br w:type="page"/>
+      </w:r>
+    </w:p>
+    <w:p>
+      <w:pPr>
+        <w:pStyle w:val="Heading1"/>
+      </w:pPr>
+      <w:r>
+        <w:rPr>
+          <w:rFonts w:ascii="等线" w:hAnsi="等线" w:eastAsia="等线"/>
+          <w:sz w:val="32"/>
+        </w:rPr>
+        <w:t>时间连续性、静默自动任务与独立云边界规范（v996／1.0.117 起）</w:t>
+      </w:r>
+    </w:p>
+    <w:p>
+      <w:pPr>
+        <w:spacing w:after="120" w:line="300" w:lineRule="auto"/>
+      </w:pPr>
+      <w:r>
+        <w:rPr>
+          <w:rFonts w:ascii="等线" w:hAnsi="等线" w:eastAsia="等线"/>
+          <w:sz w:val="21"/>
+        </w:rPr>
+        <w:t>任何显示“已总结、已保存、已绑定、已备份”的成功反馈，都必须发生在对应持久化完成之后；iOS 可能在下一瞬间挂起，延迟 save 不能作为成功依据。云端已有备份时禁止自动上传或下载覆盖，必须先展示来源与时间并由用户选择。</w:t>
+      </w:r>
+    </w:p>
+    <w:p>
+      <w:pPr>
+        <w:spacing w:after="120" w:line="300" w:lineRule="auto"/>
+      </w:pPr>
+      <w:r>
+        <w:rPr>
+          <w:rFonts w:ascii="等线" w:hAnsi="等线" w:eastAsia="等线"/>
+          <w:sz w:val="21"/>
+        </w:rPr>
+        <w:t>角色时间不能只在提示词里写当前小时。跨日事件必须同时保留绝对时间、角色时区、日历日期和持续时长；睡眠/醒来等状态转换要明确区分睡前旧话题与醒来后的新事件。精确报时时在实际送达前再校正。</w:t>
+      </w:r>
+    </w:p>
+    <w:p>
+      <w:pPr>
+        <w:spacing w:after="120" w:line="300" w:lineRule="auto"/>
+      </w:pPr>
+      <w:r>
+        <w:rPr>
+          <w:rFonts w:ascii="等线" w:hAnsi="等线" w:eastAsia="等线"/>
+          <w:sz w:val="21"/>
+        </w:rPr>
+        <w:t>启动、恢复前台、定时扫描等自动任务不得复用手动页面的可见失败提示。自动失败应静默并持久化退避，避免每次启动重复请求；只有用户主动进入对应功能时才显示明确错误和可操作重试。</w:t>
+      </w:r>
+    </w:p>
+    <w:p>
+      <w:pPr>
+        <w:spacing w:after="120" w:line="300" w:lineRule="auto"/>
+      </w:pPr>
+      <w:r>
+        <w:rPr>
+          <w:rFonts w:ascii="等线" w:hAnsi="等线" w:eastAsia="等线"/>
+          <w:sz w:val="21"/>
+        </w:rPr>
+        <w:t>视频通话开启摄像头时，TTS、识别和画面抓帧必须共享稳定的原生媒体会话。不得因每句角色回复暂停、拆除或重建摄像头/音频会话；摄像头关闭后才允许按原流程恢复普通音频会话。</w:t>
+      </w:r>
+    </w:p>
+    <w:p>
+      <w:pPr>
+        <w:spacing w:after="120" w:line="300" w:lineRule="auto"/>
+      </w:pPr>
+      <w:r>
+        <w:rPr>
+          <w:rFonts w:ascii="等线" w:hAnsi="等线" w:eastAsia="等线"/>
+          <w:sz w:val="21"/>
+        </w:rPr>
+        <w:t>意图路由必须先区分“用户自己使用 App”和“要求角色查看/控制 App”。词语“刷、看看”不能单独触发查岗；主语、指令对象和动作方向必须同时成立。早期工具通道即使无数据变化也不能吞掉普通聊天回复。</w:t>
+      </w:r>
+    </w:p>
+    <w:p>
+      <w:pPr>
+        <w:spacing w:after="120" w:line="300" w:lineRule="auto"/>
+      </w:pPr>
+      <w:r>
+        <w:rPr>
+          <w:rFonts w:ascii="等线" w:hAnsi="等线" w:eastAsia="等线"/>
+          <w:sz w:val="21"/>
+        </w:rPr>
+        <w:t>邀请码、旧业务和伴生后台必须保持三条独立云边界：邀请码备用项目只能部署 phone-license；伴生同步、APNs、角色后台任务和私人账号只使用独立伴生项目；其他既有网页业务仍保留旧服务。端点迁移后要同时核对客户端、原生桥、Edge Function、cron、迁移记录和允许域名，禁止把一个项目健康误判成全部链路健康。</w:t>
+      </w:r>
+    </w:p>
+    <w:p>
+      <w:pPr>
+        <w:spacing w:after="120" w:line="300" w:lineRule="auto"/>
+      </w:pPr>
+      <w:r>
+        <w:rPr>
+          <w:rFonts w:ascii="等线" w:hAnsi="等线" w:eastAsia="等线"/>
+          <w:sz w:val="21"/>
+        </w:rPr>
+        <w:t>新建云项目时必须记录项目 ref、区域、迁移清单、函数列表和无密钥运行说明。不得把 PAT、数据库密码、APNs 私钥或用户凭据写入仓库。若建项密码未安全保存，应明确要求后台重置，不能猜测或伪造。</w:t>
+      </w:r>
+    </w:p>
+    <w:p>
+      <w:pPr>
+        <w:pStyle w:val="Heading1"/>
+        <w:pageBreakBefore/>
+      </w:pPr>
+      <w:r>
+        <w:rPr>
+          <w:rFonts w:ascii="等线" w:hAnsi="等线" w:eastAsia="等线"/>
+          <w:sz w:val="32"/>
+        </w:rPr>
+        <w:t>网页版与私人 App 伴生能力隔离规范（v996／1.0.117 起）</w:t>
+      </w:r>
+    </w:p>
+    <w:p>
+      <w:pPr>
+        <w:spacing w:after="120" w:line="300" w:lineRule="auto"/>
+      </w:pPr>
+      <w:r>
+        <w:rPr>
+          <w:rFonts w:ascii="等线" w:hAnsi="等线" w:eastAsia="等线"/>
+          <w:sz w:val="21"/>
+        </w:rPr>
+        <w:t>共享 app.js 只代表共享可复用业务实现，不代表网页版可以获得私人能力。真实 iPhone 伴生、APNs、手机号私人账号、后台角色云队列、Family Controls、Device Activity、HealthKit 和原生控制一律以 privateCompanionAppOn/privateNativeAppOn 为硬门槛。</w:t>
+      </w:r>
+    </w:p>
+    <w:p>
+      <w:pPr>
+        <w:spacing w:after="120" w:line="300" w:lineRule="auto"/>
+      </w:pPr>
+      <w:r>
+        <w:rPr>
+          <w:rFonts w:ascii="等线" w:hAnsi="等线" w:eastAsia="等线"/>
+          <w:sz w:val="21"/>
+        </w:rPr>
+        <w:t>私人能力必须同时隔离四层：网页版不渲染入口；直接调用返回明确的私人 App 限制；定时器、恢复前台和旧数据不能触发网络；角色提示词与动作解析不得读取或复述伴生缓存。只隐藏按钮而保留后台请求，或只拦 RPC 而泄露提示词，都不算隔离完成。</w:t>
+      </w:r>
+    </w:p>
+    <w:p>
+      <w:pPr>
+        <w:spacing w:after="120" w:line="300" w:lineRule="auto"/>
+      </w:pPr>
+      <w:r>
+        <w:rPr>
+          <w:rFonts w:ascii="等线" w:hAnsi="等线" w:eastAsia="等线"/>
+          <w:sz w:val="21"/>
+        </w:rPr>
+        <w:t>共享文件中的独立伴生云 URL 可以作为私人构建所需常量保留，但网页版运行时不得向它发出请求。新增任何伴生端点时必须同时检查 companionRpc 之外的直接 fetch、keepalive、Edge Function 和启动/前台定时器，并加入网页版无原生桥回归。</w:t>
+      </w:r>
+    </w:p>
+    <w:p>
+      <w:pPr>
+        <w:spacing w:after="120" w:line="300" w:lineRule="auto"/>
+      </w:pPr>
+      <w:r>
+        <w:rPr>
+          <w:rFonts w:ascii="等线" w:hAnsi="等线" w:eastAsia="等线"/>
+          <w:sz w:val="21"/>
+        </w:rPr>
+        <w:t>网页版的普通主动消息、网页聊天、网页电话、既有查岗和其他公开功能与私人后台伴生不是同一能力。做隔离时只关闭私人链路，不得借机删除或改变网页自己的正常功能。</w:t>
+      </w:r>
+    </w:p>
+    <w:p>
+      <w:pPr>
+        <w:pStyle w:val="Heading1"/>
+        <w:pageBreakBefore/>
+      </w:pPr>
+      <w:r>
+        <w:rPr>
+          <w:rFonts w:ascii="等线" w:hAnsi="等线" w:eastAsia="等线"/>
+          <w:sz w:val="32"/>
+        </w:rPr>
+        <w:t>后台真实查询、朋友圈真实性与精确远控规范（v1001／1.0.122 起）</w:t>
+      </w:r>
+    </w:p>
+    <w:p>
+      <w:pPr>
+        <w:spacing w:after="120" w:line="300" w:lineRule="auto"/>
+      </w:pPr>
+      <w:r>
+        <w:rPr>
+          <w:rFonts w:ascii="等线" w:hAnsi="等线" w:eastAsia="等线"/>
+          <w:sz w:val="21"/>
+        </w:rPr>
+        <w:t>后台自动规则必须区分配置开关、临时租约、真实入队、原生执行、快照上传和角色可见投递六层状态。不能因为命令表有记录就宣称功能有效；验收至少要核对命令终态、快照新鲜度、outbox 或可见消息，并防止同类刷新在上一条未完成时反复覆盖。</w:t>
+      </w:r>
+    </w:p>
+    <w:p>
+      <w:pPr>
+        <w:spacing w:after="120" w:line="300" w:lineRule="auto"/>
+      </w:pPr>
+      <w:r>
+        <w:rPr>
+          <w:rFonts w:ascii="等线" w:hAnsi="等线" w:eastAsia="等线"/>
+          <w:sz w:val="21"/>
+        </w:rPr>
+        <w:t>低电、位置、心率和使用记录只能依据真实手机新快照。低电规则要同时判断阈值、是否充电、新鲜度和同轮去重；心率主动查看频率可由角色自主，但难过关心和用户明确要求必须真正排队读取，失败不得编造数值。手动解锁告知只接受原生执行成功记录，不能把角色自己下达的解锁命令当成用户偷偷解锁。</w:t>
+      </w:r>
+    </w:p>
+    <w:p>
+      <w:pPr>
+        <w:spacing w:after="120" w:line="300" w:lineRule="auto"/>
+      </w:pPr>
+      <w:r>
+        <w:rPr>
+          <w:rFonts w:ascii="等线" w:hAnsi="等线" w:eastAsia="等线"/>
+          <w:sz w:val="21"/>
+        </w:rPr>
+        <w:t>每日必查项必须保存按角色时区计算的日键和成功记录。失败、超时或无新快照不算当日已查；普通主动消息节流不得阻止每日必查。时区修正只能解决时段计算，不能替代命令队列、原生执行和结果投递检查。</w:t>
+      </w:r>
+    </w:p>
+    <w:p>
+      <w:pPr>
+        <w:spacing w:after="120" w:line="300" w:lineRule="auto"/>
+      </w:pPr>
+      <w:r>
+        <w:rPr>
+          <w:rFonts w:ascii="等线" w:hAnsi="等线" w:eastAsia="等线"/>
+          <w:sz w:val="21"/>
+        </w:rPr>
+        <w:t>朋友圈评论与照片遵守真实性边界：只有真实模型返回的评论才能入库；失败界面提供重试但不插入占位假话。用户明确要求带图时，发布动作必须等待真实照片复用或真实生图结果，失败如实反馈。置顶只改变显示顺序，不改历史时间或复制动态。</w:t>
+      </w:r>
+    </w:p>
+    <w:p>
+      <w:pPr>
+        <w:spacing w:after="120" w:line="300" w:lineRule="auto"/>
+      </w:pPr>
+      <w:r>
+        <w:rPr>
+          <w:rFonts w:ascii="等线" w:hAnsi="等线" w:eastAsia="等线"/>
+          <w:sz w:val="21"/>
+        </w:rPr>
+        <w:t>聊天头像与消息气泡必须分离点击语义：头像进入联系人/聊天详情，气泡进入消息操作；图片查看从消息菜单继续进入。删除角色拍一拍时同时清理入口、动作函数、输出标签、提示词和虚拟群角色处理，但不得误删真实好友群聊的独立能力。</w:t>
+      </w:r>
+    </w:p>
+    <w:p>
+      <w:pPr>
+        <w:spacing w:after="120" w:line="300" w:lineRule="auto"/>
+      </w:pPr>
+      <w:r>
+        <w:rPr>
+          <w:rFonts w:ascii="等线" w:hAnsi="等线" w:eastAsia="等线"/>
+          <w:sz w:val="21"/>
+        </w:rPr>
+        <w:t>远程查看动作必须绑定具体页面和目标内容，界面应反馈目标名称与进度。不能用随机点击动画冒充已查看；无法定位时应保持可解释状态并重试或结束。</w:t>
+      </w:r>
+    </w:p>
+    <w:p>
+      <w:pPr>
+        <w:pStyle w:val="Heading1"/>
+        <w:pageBreakBefore/>
+      </w:pPr>
+      <w:r>
+        <w:rPr>
+          <w:rFonts w:ascii="等线" w:hAnsi="等线" w:eastAsia="等线"/>
+          <w:sz w:val="32"/>
+        </w:rPr>
+        <w:t>入口语义与异步完成状态规范（v1002／1.0.123 起）</w:t>
+      </w:r>
+    </w:p>
+    <w:p>
+      <w:pPr>
+        <w:spacing w:after="120" w:line="300" w:lineRule="auto"/>
+      </w:pPr>
+      <w:r>
+        <w:rPr>
+          <w:rFonts w:ascii="等线" w:hAnsi="等线" w:eastAsia="等线"/>
+          <w:sz w:val="21"/>
+        </w:rPr>
+        <w:t>同一界面中的头像、右上角更多按钮和消息气泡是三个独立入口。修改其中一个时必须分别断言各自目标，禁止用包含某个路由的宽泛测试掩盖入口合并。</w:t>
+      </w:r>
+    </w:p>
+    <w:p>
+      <w:pPr>
+        <w:spacing w:after="120" w:line="300" w:lineRule="auto"/>
+      </w:pPr>
+      <w:r>
+        <w:rPr>
+          <w:rFonts w:ascii="等线" w:hAnsi="等线" w:eastAsia="等线"/>
+          <w:sz w:val="21"/>
+        </w:rPr>
+        <w:t>设备读取完成与角色回复生成是两个阶段。完成横幅只能反映真实读取阶段，读取结束后必须按固定短延迟关闭，不能被网络模型请求占用。</w:t>
+      </w:r>
+    </w:p>
+    <w:p>
+      <w:pPr>
+        <w:spacing w:after="120" w:line="300" w:lineRule="auto"/>
+      </w:pPr>
+      <w:r>
+        <w:rPr>
+          <w:rFonts w:ascii="等线" w:hAnsi="等线" w:eastAsia="等线"/>
+          <w:sz w:val="21"/>
+        </w:rPr>
+        <w:t>模型回复失败时保存真实读取结果并退避重试；不得重新读取制造重复命令，不得写入固定假回复。跨页面生成的现场回复必须告诉用户真实落点，不能把共同生活消息伪装成微信消息。</w:t>
+      </w:r>
+    </w:p>
+    <w:p>
+      <w:pPr>
+        <w:pStyle w:val="Heading1"/>
+        <w:pageBreakBefore/>
+      </w:pPr>
+      <w:r>
+        <w:rPr>
+          <w:rFonts w:ascii="等线" w:hAnsi="等线" w:eastAsia="等线"/>
+          <w:sz w:val="32"/>
+        </w:rPr>
+        <w:t>持久模型重试不得占用旧稳定回复链（v1002 回复回归后）</w:t>
+      </w:r>
+    </w:p>
+    <w:p>
+      <w:pPr>
+        <w:spacing w:after="120" w:line="300" w:lineRule="auto"/>
+      </w:pPr>
+      <w:r>
+        <w:rPr>
+          <w:rFonts w:ascii="等线" w:hAnsi="等线" w:eastAsia="等线"/>
+          <w:sz w:val="21"/>
+        </w:rPr>
+        <w:t>用户指出明确历史正常版本时，必须把该版本作为最后正常基线，逐行比较新增状态、定时器、全局锁和模型调用次数。不能因为新功能测试通过，就默认普通聊天、朋友圈和模型测试没有被并发链影响。</w:t>
+      </w:r>
+    </w:p>
+    <w:p>
+      <w:pPr>
+        <w:spacing w:after="120" w:line="300" w:lineRule="auto"/>
+      </w:pPr>
+      <w:r>
+        <w:rPr>
+          <w:rFonts w:ascii="等线" w:hAnsi="等线" w:eastAsia="等线"/>
+          <w:sz w:val="21"/>
+        </w:rPr>
+        <w:t>真实数据可以持久保存，但模型生成失败不得由短周期定时器跨重启无限自动重放，更不得在重放期间长期持有会阻止普通回复的全局读取通道。任何自动重试都必须有总次数、总时长、并发所有权和旧功能可用性测试；没有这些保护时只能保存为人工重试状态。</w:t>
+      </w:r>
+    </w:p>
+    <w:p>
+      <w:pPr>
+        <w:spacing w:after="120" w:line="300" w:lineRule="auto"/>
+      </w:pPr>
+      <w:r>
+        <w:rPr>
+          <w:rFonts w:ascii="等线" w:hAnsi="等线" w:eastAsia="等线"/>
+          <w:sz w:val="21"/>
+        </w:rPr>
+        <w:t>回复包装器必须同时识别两种正常读取接管：运行前通道已经占用，以及运行期间读取代次发生变化。两种情况都不得二次请求、不得显示模型空回复或 API 故障提示。</w:t>
+      </w:r>
+    </w:p>
+    <w:p>
+      <w:pPr>
+        <w:spacing w:after="120" w:line="300" w:lineRule="auto"/>
+      </w:pPr>
+      <w:r>
+        <w:rPr>
+          <w:rFonts w:ascii="等线" w:hAnsi="等线" w:eastAsia="等线"/>
+          <w:sz w:val="21"/>
+        </w:rPr>
+        <w:t>朋友圈回复失败或 App 挂起后只显示真实失败和重试入口，禁止补写角色假回复。回归至少覆盖：旧 retryAt 存档迁移、读取通道预先占用、读取中途接管、朋友圈冷启动 pending 修复、普通回复与朋友圈不被后台重放拖慢。</w:t>
+      </w:r>
+    </w:p>
+    <w:p>
+      <w:pPr>
+        <w:pStyle w:val="Heading1"/>
+        <w:pageBreakBefore/>
+      </w:pPr>
+      <w:r>
+        <w:rPr>
+          <w:rFonts w:ascii="等线" w:hAnsi="等线" w:eastAsia="等线"/>
+          <w:sz w:val="32"/>
+        </w:rPr>
+        <w:t>v1003 回复回归发布门槛</w:t>
+      </w:r>
+    </w:p>
+    <w:p>
+      <w:pPr>
+        <w:spacing w:after="120" w:line="300" w:lineRule="auto"/>
+      </w:pPr>
+      <w:r>
+        <w:rPr>
+          <w:rFonts w:ascii="等线" w:hAnsi="等线" w:eastAsia="等线"/>
+          <w:sz w:val="21"/>
+        </w:rPr>
+        <w:t>涉及模型重试、全局读取通道或持久 pending 状态的发布，除功能测试外必须验证旧正常聊天和朋友圈在失败、挂起、重启后的可用性。只断言“有重试”不算覆盖。</w:t>
+      </w:r>
+    </w:p>
+    <w:p>
+      <w:pPr>
+        <w:spacing w:after="120" w:line="300" w:lineRule="auto"/>
+      </w:pPr>
+      <w:r>
+        <w:rPr>
+          <w:rFonts w:ascii="等线" w:hAnsi="等线" w:eastAsia="等线"/>
+          <w:sz w:val="21"/>
+        </w:rPr>
+        <w:t>发布身份必须原子更新网页 APP_VER、HTML build、Service Worker build／cache／注册 URL、index／repair、私人 Bundle Info、十二处 Xcode marketing/build、原生可见构建号、测试断言和安装说明。</w:t>
+      </w:r>
+    </w:p>
+    <w:p>
+      <w:pPr>
+        <w:spacing w:after="120" w:line="300" w:lineRule="auto"/>
+      </w:pPr>
+      <w:r>
+        <w:rPr>
+          <w:rFonts w:ascii="等线" w:hAnsi="等线" w:eastAsia="等线"/>
+          <w:sz w:val="21"/>
+        </w:rPr>
+        <w:t>私人包必须从 manifest 重建唯一 PhoneWeb.bundle，并从全新暂存目录压缩；只允许一个当前安装说明。Windows 850／850 不能替代 Mac 编译和真机回复时延验收。</w:t>
+      </w:r>
+    </w:p>
+    <w:p>
+      <w:pPr>
+        <w:pStyle w:val="Heading1"/>
+        <w:pageBreakBefore/>
+      </w:pPr>
+      <w:r>
+        <w:rPr>
+          <w:rFonts w:ascii="等线" w:hAnsi="等线" w:eastAsia="等线"/>
+          <w:sz w:val="32"/>
+        </w:rPr>
+        <w:t>v1006 后台送达、通话与朋友圈回复回归规则</w:t>
+      </w:r>
+    </w:p>
+    <w:p>
+      <w:pPr>
+        <w:spacing w:after="120" w:line="300" w:lineRule="auto"/>
+      </w:pPr>
+      <w:r>
+        <w:rPr>
+          <w:rFonts w:ascii="等线" w:hAnsi="等线" w:eastAsia="等线"/>
+          <w:sz w:val="21"/>
+        </w:rPr>
+        <w:t>伴生云迁移或新建项目时，必须分别清点数据库／RPC、定时任务、APNs、设备令牌和模型提供方。只看到 APNs 密钥或预检通过，绝不能推断角色已经可以在服务器生成消息。</w:t>
+      </w:r>
+    </w:p>
+    <w:p>
+      <w:pPr>
+        <w:spacing w:after="120" w:line="300" w:lineRule="auto"/>
+      </w:pPr>
+      <w:r>
+        <w:rPr>
+          <w:rFonts w:ascii="等线" w:hAnsi="等线" w:eastAsia="等线"/>
+          <w:sz w:val="21"/>
+        </w:rPr>
+        <w:t>后台测试的入队成功不等于送达成功。必须保留任务 ID，继续核对模型生成、outbox、APNs 状态与错误；界面只能报告实际到达的阶段，不能用倒计时或本地假消息代替回执。</w:t>
+      </w:r>
+    </w:p>
+    <w:p>
+      <w:pPr>
+        <w:spacing w:after="120" w:line="300" w:lineRule="auto"/>
+      </w:pPr>
+      <w:r>
+        <w:rPr>
+          <w:rFonts w:ascii="等线" w:hAnsi="等线" w:eastAsia="等线"/>
+          <w:sz w:val="21"/>
+        </w:rPr>
+        <w:t>私人能力隔离包装必须用 rest 参数完整转发调用参数，并以测试固定 keepalive 等语义参数；禁止包装后静默改变函数契约。</w:t>
+      </w:r>
+    </w:p>
+    <w:p>
+      <w:pPr>
+        <w:spacing w:after="120" w:line="300" w:lineRule="auto"/>
+      </w:pPr>
+      <w:r>
+        <w:rPr>
+          <w:rFonts w:ascii="等线" w:hAnsi="等线" w:eastAsia="等线"/>
+          <w:sz w:val="21"/>
+        </w:rPr>
+        <w:t>凡界面声称使用“当前模型”，必须真的同步角色当前线路并执行服务器端测试。同步地址只允许 HTTPS 且拒绝本机和私网；关闭后台能力时清除线路，并向用户明确披露同步范围。</w:t>
+      </w:r>
+    </w:p>
+    <w:p>
+      <w:pPr>
+        <w:spacing w:after="120" w:line="300" w:lineRule="auto"/>
+      </w:pPr>
+      <w:r>
+        <w:rPr>
+          <w:rFonts w:ascii="等线" w:hAnsi="等线" w:eastAsia="等线"/>
+          <w:sz w:val="21"/>
+        </w:rPr>
+        <w:t>通话和朋友圈模型请求必须设置历史、线程、单条内容与总提示预算，并按当前内容选取长期记忆。朋友圈失败只能显示重试，禁止任何本地假回复或固定兜底冒充角色。</w:t>
+      </w:r>
+    </w:p>
+    <w:p>
+      <w:pPr>
+        <w:spacing w:after="120" w:line="300" w:lineRule="auto"/>
+      </w:pPr>
+      <w:r>
+        <w:rPr>
+          <w:rFonts w:ascii="等线" w:hAnsi="等线" w:eastAsia="等线"/>
+          <w:sz w:val="21"/>
+        </w:rPr>
+        <w:t>Windows 自动测试只能证明代码与回归基线；Mac 编译、Apple 签名、后台挂起、电话音频／字幕和通知展示必须在真实 iPhone 单独验收。</w:t>
       </w:r>
     </w:p>
     <w:sectPr>

</xml_diff>